<commit_message>
security: implement bcrypt hashing, JWT auth, helmet headers and winston logging
</commit_message>
<xml_diff>
--- a/report/Week 1.docx
+++ b/report/Week 1.docx
@@ -235,15 +235,6 @@
                                     </w:rPr>
                                     <w:t>𝐩𝐫𝐨𝐠𝐫𝐚𝐦</w:t>
                                   </w:r>
-                                  <w:r>
-                                    <w:rPr>
-                                      <w:color w:val="FFFFFF" w:themeColor="background1"/>
-                                      <w:sz w:val="72"/>
-                                      <w:szCs w:val="72"/>
-                                    </w:rPr>
-                                    <w:br/>
-                                    <w:t>(Week 1)</w:t>
-                                  </w:r>
                                 </w:p>
                               </w:txbxContent>
                             </wps:txbx>
@@ -449,15 +440,6 @@
                                 <w:szCs w:val="72"/>
                               </w:rPr>
                               <w:t>𝐩𝐫𝐨𝐠𝐫𝐚𝐦</w:t>
-                            </w:r>
-                            <w:r>
-                              <w:rPr>
-                                <w:color w:val="FFFFFF" w:themeColor="background1"/>
-                                <w:sz w:val="72"/>
-                                <w:szCs w:val="72"/>
-                              </w:rPr>
-                              <w:br/>
-                              <w:t>(Week 1)</w:t>
                             </w:r>
                           </w:p>
                         </w:txbxContent>
@@ -1276,20 +1258,24 @@
     <w:p/>
     <w:p>
       <w:r>
+        <w:t>Tool Used</w:t>
+      </w:r>
+      <w:r>
+        <w:t>: Browser Developer Tools, Manual payload injection</w:t>
+      </w:r>
+    </w:p>
+    <w:p>
+      <w:r>
+        <w:t>Fields Tested: Search bar, Product review section, URL parameters</w:t>
+      </w:r>
+    </w:p>
+    <w:p>
+      <w:pPr>
         <w:rPr>
           <w:b/>
           <w:bCs/>
         </w:rPr>
-        <w:t>Tool Used</w:t>
-      </w:r>
-      <w:r>
-        <w:t>: Browser Developer Tools, Manual payload injection</w:t>
-      </w:r>
-    </w:p>
-    <w:p>
-      <w:r>
-        <w:t>Fields Tested: Search bar, Product review section, URL parameters</w:t>
-      </w:r>
+      </w:pPr>
     </w:p>
     <w:p>
       <w:pPr>
@@ -1298,129 +1284,121 @@
           <w:bCs/>
         </w:rPr>
       </w:pPr>
-    </w:p>
-    <w:p>
-      <w:pPr>
+      <w:r>
         <w:rPr>
           <w:b/>
           <w:bCs/>
         </w:rPr>
-      </w:pPr>
-      <w:r>
+        <w:t>Test 1 — Search Bar:</w:t>
+      </w:r>
+    </w:p>
+    <w:p>
+      <w:r>
+        <w:t>Payload: &lt;</w:t>
+      </w:r>
+      <w:proofErr w:type="spellStart"/>
+      <w:r>
+        <w:t>iframe</w:t>
+      </w:r>
+      <w:proofErr w:type="spellEnd"/>
+      <w:r>
+        <w:t xml:space="preserve"> </w:t>
+      </w:r>
+      <w:proofErr w:type="spellStart"/>
+      <w:r>
+        <w:t>src</w:t>
+      </w:r>
+      <w:proofErr w:type="spellEnd"/>
+      <w:r>
+        <w:t>="</w:t>
+      </w:r>
+      <w:proofErr w:type="spellStart"/>
+      <w:proofErr w:type="gramStart"/>
+      <w:r>
+        <w:t>javascript:alert</w:t>
+      </w:r>
+      <w:proofErr w:type="spellEnd"/>
+      <w:proofErr w:type="gramEnd"/>
+      <w:r>
+        <w:t>('XSS')"&gt;</w:t>
+      </w:r>
+    </w:p>
+    <w:p>
+      <w:r>
+        <w:t xml:space="preserve">Result: </w:t>
+      </w:r>
+      <w:r>
+        <w:t>An alert popped up as soon as I pressed enter</w:t>
+      </w:r>
+    </w:p>
+    <w:p>
+      <w:r>
+        <w:t>Severity: High</w:t>
+      </w:r>
+    </w:p>
+    <w:p/>
+    <w:p>
+      <w:pPr>
         <w:rPr>
           <w:b/>
           <w:bCs/>
         </w:rPr>
-        <w:t>Test 1 — Search Bar:</w:t>
-      </w:r>
-    </w:p>
-    <w:p>
-      <w:r>
-        <w:t>Payload: &lt;</w:t>
-      </w:r>
-      <w:proofErr w:type="spellStart"/>
-      <w:r>
-        <w:t>iframe</w:t>
-      </w:r>
-      <w:proofErr w:type="spellEnd"/>
-      <w:r>
-        <w:t xml:space="preserve"> </w:t>
-      </w:r>
-      <w:proofErr w:type="spellStart"/>
-      <w:r>
-        <w:t>src</w:t>
-      </w:r>
-      <w:proofErr w:type="spellEnd"/>
-      <w:r>
-        <w:t>="</w:t>
-      </w:r>
-      <w:proofErr w:type="spellStart"/>
-      <w:proofErr w:type="gramStart"/>
-      <w:r>
-        <w:t>javascript:alert</w:t>
-      </w:r>
-      <w:proofErr w:type="spellEnd"/>
-      <w:proofErr w:type="gramEnd"/>
-      <w:r>
-        <w:t>('XSS')"&gt;</w:t>
-      </w:r>
-    </w:p>
-    <w:p>
-      <w:r>
-        <w:t xml:space="preserve">Result: </w:t>
-      </w:r>
-      <w:r>
-        <w:t>An alert popped up as soon as I pressed enter</w:t>
-      </w:r>
-    </w:p>
-    <w:p>
-      <w:r>
-        <w:t>Severity: High</w:t>
-      </w:r>
-    </w:p>
-    <w:p/>
-    <w:p>
-      <w:pPr>
+      </w:pPr>
+      <w:r>
         <w:rPr>
           <w:b/>
           <w:bCs/>
         </w:rPr>
-      </w:pPr>
-      <w:r>
+        <w:t>Test 2 — Product Review:</w:t>
+      </w:r>
+    </w:p>
+    <w:p>
+      <w:r>
+        <w:t>Payload: &lt;script&gt;</w:t>
+      </w:r>
+      <w:proofErr w:type="gramStart"/>
+      <w:r>
+        <w:t>alert(</w:t>
+      </w:r>
+      <w:proofErr w:type="gramEnd"/>
+      <w:r>
+        <w:t>'XSS in review</w:t>
+      </w:r>
+      <w:proofErr w:type="gramStart"/>
+      <w:r>
+        <w:t>')&lt;</w:t>
+      </w:r>
+      <w:proofErr w:type="gramEnd"/>
+      <w:r>
+        <w:t>/script&gt;</w:t>
+      </w:r>
+    </w:p>
+    <w:p>
+      <w:r>
+        <w:t xml:space="preserve">Result: </w:t>
+      </w:r>
+      <w:r>
+        <w:t>Nothing showed up</w:t>
+      </w:r>
+    </w:p>
+    <w:p>
+      <w:r>
+        <w:t>Severity: High</w:t>
+      </w:r>
+    </w:p>
+    <w:p/>
+    <w:p>
+      <w:pPr>
         <w:rPr>
           <w:b/>
           <w:bCs/>
         </w:rPr>
-        <w:t>Test 2 — Product Review:</w:t>
-      </w:r>
-    </w:p>
-    <w:p>
-      <w:r>
-        <w:t>Payload: &lt;script&gt;</w:t>
-      </w:r>
-      <w:proofErr w:type="gramStart"/>
-      <w:r>
-        <w:t>alert(</w:t>
-      </w:r>
-      <w:proofErr w:type="gramEnd"/>
-      <w:r>
-        <w:t>'XSS in review</w:t>
-      </w:r>
-      <w:proofErr w:type="gramStart"/>
-      <w:r>
-        <w:t>')&lt;</w:t>
-      </w:r>
-      <w:proofErr w:type="gramEnd"/>
-      <w:r>
-        <w:t>/script&gt;</w:t>
-      </w:r>
-    </w:p>
-    <w:p>
-      <w:r>
-        <w:t xml:space="preserve">Result: </w:t>
-      </w:r>
-      <w:r>
-        <w:t>Nothing showed up</w:t>
-      </w:r>
-    </w:p>
-    <w:p>
-      <w:r>
-        <w:t>Severity: High</w:t>
-      </w:r>
-    </w:p>
-    <w:p/>
-    <w:p>
-      <w:pPr>
+      </w:pPr>
+      <w:r>
         <w:rPr>
           <w:b/>
           <w:bCs/>
         </w:rPr>
-      </w:pPr>
-      <w:r>
-        <w:rPr>
-          <w:b/>
-          <w:bCs/>
-        </w:rPr>
         <w:t>Test 3 — DOM XSS via URL:</w:t>
       </w:r>
     </w:p>
@@ -1450,7 +1428,7 @@
         </w:rPr>
         <w:lastRenderedPageBreak/>
         <w:drawing>
-          <wp:inline distT="0" distB="0" distL="0" distR="0" wp14:anchorId="7A27340A" wp14:editId="42272E2F">
+          <wp:inline distT="0" distB="0" distL="0" distR="0" wp14:anchorId="7A27340A" wp14:editId="606C95D0">
             <wp:extent cx="5943600" cy="3149600"/>
             <wp:effectExtent l="0" t="0" r="0" b="0"/>
             <wp:docPr id="1232960218" name="Picture 5"/>
@@ -1496,7 +1474,7 @@
           <w:noProof/>
         </w:rPr>
         <w:drawing>
-          <wp:inline distT="0" distB="0" distL="0" distR="0" wp14:anchorId="7F37D00D" wp14:editId="5BA77458">
+          <wp:inline distT="0" distB="0" distL="0" distR="0" wp14:anchorId="7F37D00D" wp14:editId="1694AAE3">
             <wp:extent cx="5943600" cy="3149600"/>
             <wp:effectExtent l="0" t="0" r="0" b="0"/>
             <wp:docPr id="1497399989" name="Picture 6"/>
@@ -1773,10 +1751,6 @@
     </w:p>
     <w:p>
       <w:r>
-        <w:rPr>
-          <w:b/>
-          <w:bCs/>
-        </w:rPr>
         <w:t>Impact</w:t>
       </w:r>
       <w:r>
@@ -1830,69 +1804,68 @@
     <w:p/>
     <w:p>
       <w:r>
+        <w:t>Tool Used</w:t>
+      </w:r>
+      <w:r>
+        <w:t>: Manual testing on login form</w:t>
+      </w:r>
+    </w:p>
+    <w:p>
+      <w:r>
+        <w:t>Fields Tested</w:t>
+      </w:r>
+      <w:r>
         <w:rPr>
           <w:b/>
           <w:bCs/>
         </w:rPr>
-        <w:t>Tool Used</w:t>
-      </w:r>
-      <w:r>
-        <w:t>: Manual testing on login form</w:t>
-      </w:r>
-    </w:p>
+        <w:t>:</w:t>
+      </w:r>
+      <w:r>
+        <w:t xml:space="preserve"> Email and password fields on login page</w:t>
+      </w:r>
+    </w:p>
+    <w:p/>
     <w:p>
       <w:r>
         <w:rPr>
           <w:b/>
           <w:bCs/>
         </w:rPr>
-        <w:t>Fields Tested:</w:t>
-      </w:r>
-      <w:r>
-        <w:t xml:space="preserve"> Email and password fields on login page</w:t>
+        <w:t>Test 1 — Login Bypass</w:t>
+      </w:r>
+      <w:r>
+        <w:t>:</w:t>
+      </w:r>
+    </w:p>
+    <w:p>
+      <w:r>
+        <w:t>Payload: ' OR 1=1-- (email field)</w:t>
+      </w:r>
+    </w:p>
+    <w:p>
+      <w:r>
+        <w:t>Result: Successfully logged in as administrator without valid credentials</w:t>
+      </w:r>
+    </w:p>
+    <w:p>
+      <w:r>
+        <w:t>Severity: CRITICAL</w:t>
       </w:r>
     </w:p>
     <w:p/>
     <w:p>
-      <w:r>
+      <w:pPr>
         <w:rPr>
           <w:b/>
           <w:bCs/>
         </w:rPr>
-        <w:t>Test 1 — Login Bypass</w:t>
-      </w:r>
-      <w:r>
-        <w:t>:</w:t>
-      </w:r>
-    </w:p>
-    <w:p>
-      <w:r>
-        <w:t>Payload: ' OR 1=1-- (email field)</w:t>
-      </w:r>
-    </w:p>
-    <w:p>
-      <w:r>
-        <w:t>Result: Successfully logged in as administrator without valid credentials</w:t>
-      </w:r>
-    </w:p>
-    <w:p>
-      <w:r>
-        <w:t>Severity: CRITICAL</w:t>
-      </w:r>
-    </w:p>
-    <w:p/>
-    <w:p>
-      <w:pPr>
+      </w:pPr>
+      <w:r>
         <w:rPr>
           <w:b/>
           <w:bCs/>
         </w:rPr>
-      </w:pPr>
-      <w:r>
-        <w:rPr>
-          <w:b/>
-          <w:bCs/>
-        </w:rPr>
         <w:t>Test 2 — Error-Based SQLi:</w:t>
       </w:r>
     </w:p>
@@ -1922,7 +1895,7 @@
         </w:rPr>
         <w:lastRenderedPageBreak/>
         <w:drawing>
-          <wp:inline distT="0" distB="0" distL="0" distR="0" wp14:anchorId="594189DF" wp14:editId="126584E1">
+          <wp:inline distT="0" distB="0" distL="0" distR="0" wp14:anchorId="594189DF" wp14:editId="55EA3F8B">
             <wp:extent cx="5943600" cy="3168650"/>
             <wp:effectExtent l="0" t="0" r="0" b="0"/>
             <wp:docPr id="381318417" name="Picture 12"/>
@@ -2315,22 +2288,13 @@
     </w:p>
     <w:p>
       <w:r>
-        <w:t>Target: http://</w:t>
-      </w:r>
-      <w:r>
-        <w:t xml:space="preserve">192.168.166.1: </w:t>
-      </w:r>
-      <w:r>
-        <w:t>3000</w:t>
+        <w:t>Target: http://192.168.166.1: 3000</w:t>
       </w:r>
     </w:p>
     <w:p/>
     <w:p>
       <w:r>
-        <w:t>Findings</w:t>
-      </w:r>
-      <w:r>
-        <w:t>: FULL ZAP REPORT ATTACHED IN SUBMISSIONS</w:t>
+        <w:t>Findings: FULL ZAP REPORT ATTACHED IN SUBMISSIONS</w:t>
       </w:r>
     </w:p>
     <w:p>
@@ -2435,7 +2399,17 @@
             <w:tcW w:w="474" w:type="dxa"/>
           </w:tcPr>
           <w:p>
+            <w:pPr>
+              <w:rPr>
+                <w:b/>
+                <w:bCs/>
+              </w:rPr>
+            </w:pPr>
             <w:r>
+              <w:rPr>
+                <w:b/>
+                <w:bCs/>
+              </w:rPr>
               <w:t>#</w:t>
             </w:r>
           </w:p>
@@ -2445,7 +2419,17 @@
             <w:tcW w:w="3018" w:type="dxa"/>
           </w:tcPr>
           <w:p>
+            <w:pPr>
+              <w:rPr>
+                <w:b/>
+                <w:bCs/>
+              </w:rPr>
+            </w:pPr>
             <w:r>
+              <w:rPr>
+                <w:b/>
+                <w:bCs/>
+              </w:rPr>
               <w:t>Vulnerability</w:t>
             </w:r>
           </w:p>
@@ -2455,7 +2439,17 @@
             <w:tcW w:w="1870" w:type="dxa"/>
           </w:tcPr>
           <w:p>
+            <w:pPr>
+              <w:rPr>
+                <w:b/>
+                <w:bCs/>
+              </w:rPr>
+            </w:pPr>
             <w:r>
+              <w:rPr>
+                <w:b/>
+                <w:bCs/>
+              </w:rPr>
               <w:t>Severity</w:t>
             </w:r>
           </w:p>
@@ -2465,7 +2459,17 @@
             <w:tcW w:w="1870" w:type="dxa"/>
           </w:tcPr>
           <w:p>
+            <w:pPr>
+              <w:rPr>
+                <w:b/>
+                <w:bCs/>
+              </w:rPr>
+            </w:pPr>
             <w:r>
+              <w:rPr>
+                <w:b/>
+                <w:bCs/>
+              </w:rPr>
               <w:t>Method</w:t>
             </w:r>
           </w:p>
@@ -2475,7 +2479,17 @@
             <w:tcW w:w="1870" w:type="dxa"/>
           </w:tcPr>
           <w:p>
+            <w:pPr>
+              <w:rPr>
+                <w:b/>
+                <w:bCs/>
+              </w:rPr>
+            </w:pPr>
             <w:r>
+              <w:rPr>
+                <w:b/>
+                <w:bCs/>
+              </w:rPr>
               <w:t>Status</w:t>
             </w:r>
           </w:p>
@@ -2528,7 +2542,7 @@
           </w:tcPr>
           <w:p>
             <w:r>
-              <w:t>Open</w:t>
+              <w:t>FIXED</w:t>
             </w:r>
           </w:p>
         </w:tc>
@@ -2585,7 +2599,7 @@
           </w:tcPr>
           <w:p>
             <w:r>
-              <w:t>Open</w:t>
+              <w:t>FIXED</w:t>
             </w:r>
           </w:p>
         </w:tc>
@@ -2637,7 +2651,7 @@
           </w:tcPr>
           <w:p>
             <w:r>
-              <w:t>Open</w:t>
+              <w:t>FIXED</w:t>
             </w:r>
           </w:p>
         </w:tc>
@@ -2689,7 +2703,7 @@
           </w:tcPr>
           <w:p>
             <w:r>
-              <w:t>Open</w:t>
+              <w:t>FIXED</w:t>
             </w:r>
           </w:p>
         </w:tc>
@@ -2743,12 +2757,834 @@
           </w:tcPr>
           <w:p>
             <w:r>
-              <w:t>Open</w:t>
+              <w:t>FIXED</w:t>
             </w:r>
           </w:p>
         </w:tc>
       </w:tr>
     </w:tbl>
+    <w:p/>
+    <w:p/>
+    <w:p>
+      <w:pPr>
+        <w:jc w:val="center"/>
+        <w:rPr>
+          <w:b/>
+          <w:bCs/>
+          <w:sz w:val="36"/>
+          <w:szCs w:val="36"/>
+          <w:u w:val="single"/>
+        </w:rPr>
+      </w:pPr>
+      <w:r>
+        <w:rPr>
+          <w:b/>
+          <w:bCs/>
+          <w:sz w:val="36"/>
+          <w:szCs w:val="36"/>
+          <w:u w:val="single"/>
+        </w:rPr>
+        <w:lastRenderedPageBreak/>
+        <w:t>SECTION 3 — SECURITY IMPLEMENTATIONS</w:t>
+      </w:r>
+    </w:p>
+    <w:p/>
+    <w:p>
+      <w:pPr>
+        <w:jc w:val="center"/>
+        <w:rPr>
+          <w:b/>
+          <w:bCs/>
+          <w:sz w:val="32"/>
+          <w:szCs w:val="32"/>
+        </w:rPr>
+      </w:pPr>
+      <w:r>
+        <w:rPr>
+          <w:b/>
+          <w:bCs/>
+          <w:sz w:val="32"/>
+          <w:szCs w:val="32"/>
+        </w:rPr>
+        <w:t>3.1 Input Validation &amp; Sanitization (Fix for XSS)</w:t>
+      </w:r>
+    </w:p>
+    <w:p/>
+    <w:p>
+      <w:r>
+        <w:t>Vulnerability Fixed: Cross-Site Scripting (XSS)</w:t>
+      </w:r>
+    </w:p>
+    <w:p>
+      <w:r>
+        <w:t>Library Used: validator.js</w:t>
+      </w:r>
+    </w:p>
+    <w:p>
+      <w:r>
+        <w:t>File Created: middleware/inputValidation.js</w:t>
+      </w:r>
+    </w:p>
+    <w:p/>
+    <w:p>
+      <w:r>
+        <w:t>Implementation:</w:t>
+      </w:r>
+    </w:p>
+    <w:p>
+      <w:r>
+        <w:t xml:space="preserve">- </w:t>
+      </w:r>
+      <w:proofErr w:type="spellStart"/>
+      <w:proofErr w:type="gramStart"/>
+      <w:r>
+        <w:t>validateRegistration</w:t>
+      </w:r>
+      <w:proofErr w:type="spellEnd"/>
+      <w:r>
+        <w:t>(</w:t>
+      </w:r>
+      <w:proofErr w:type="gramEnd"/>
+      <w:r>
+        <w:t xml:space="preserve">): Validates email format, enforces strong </w:t>
+      </w:r>
+    </w:p>
+    <w:p>
+      <w:r>
+        <w:t xml:space="preserve">  password policy, escapes special characters in username field</w:t>
+      </w:r>
+    </w:p>
+    <w:p>
+      <w:r>
+        <w:t xml:space="preserve">- </w:t>
+      </w:r>
+      <w:proofErr w:type="spellStart"/>
+      <w:proofErr w:type="gramStart"/>
+      <w:r>
+        <w:t>sanitizeInputs</w:t>
+      </w:r>
+      <w:proofErr w:type="spellEnd"/>
+      <w:r>
+        <w:t>(</w:t>
+      </w:r>
+      <w:proofErr w:type="gramEnd"/>
+      <w:r>
+        <w:t xml:space="preserve">): Strips HTML tags and encodes special characters </w:t>
+      </w:r>
+    </w:p>
+    <w:p>
+      <w:r>
+        <w:t xml:space="preserve">  from ALL incoming request body fields</w:t>
+      </w:r>
+    </w:p>
+    <w:p>
+      <w:r>
+        <w:t xml:space="preserve">- </w:t>
+      </w:r>
+      <w:proofErr w:type="spellStart"/>
+      <w:proofErr w:type="gramStart"/>
+      <w:r>
+        <w:t>validateSearch</w:t>
+      </w:r>
+      <w:proofErr w:type="spellEnd"/>
+      <w:r>
+        <w:t>(</w:t>
+      </w:r>
+      <w:proofErr w:type="gramEnd"/>
+      <w:r>
+        <w:t xml:space="preserve">): Detects and blocks script injection attempts </w:t>
+      </w:r>
+    </w:p>
+    <w:p>
+      <w:r>
+        <w:t xml:space="preserve">  in search queries using regex pattern matching</w:t>
+      </w:r>
+    </w:p>
+    <w:p/>
+    <w:p>
+      <w:r>
+        <w:t xml:space="preserve">Before Fix: User input was passed directly to the DOM without </w:t>
+      </w:r>
+    </w:p>
+    <w:p>
+      <w:r>
+        <w:t>sanitization, allowing &lt;script&gt; tags to execute</w:t>
+      </w:r>
+    </w:p>
+    <w:p>
+      <w:r>
+        <w:t xml:space="preserve">After Fix: All inputs </w:t>
+      </w:r>
+      <w:proofErr w:type="gramStart"/>
+      <w:r>
+        <w:t>are escaped</w:t>
+      </w:r>
+      <w:proofErr w:type="gramEnd"/>
+      <w:r>
+        <w:t xml:space="preserve"> and validated before processing,</w:t>
+      </w:r>
+    </w:p>
+    <w:p>
+      <w:r>
+        <w:t>making XSS injection impossible</w:t>
+      </w:r>
+    </w:p>
+    <w:p/>
+    <w:p>
+      <w:r>
+        <w:lastRenderedPageBreak/>
+        <w:drawing>
+          <wp:inline distT="0" distB="0" distL="0" distR="0" wp14:anchorId="10F8F75B" wp14:editId="219EFDBA">
+            <wp:extent cx="5943600" cy="3199130"/>
+            <wp:effectExtent l="0" t="0" r="0" b="1270"/>
+            <wp:docPr id="1530314397" name="Picture 1"/>
+            <wp:cNvGraphicFramePr>
+              <a:graphicFrameLocks xmlns:a="http://schemas.openxmlformats.org/drawingml/2006/main" noChangeAspect="1"/>
+            </wp:cNvGraphicFramePr>
+            <a:graphic xmlns:a="http://schemas.openxmlformats.org/drawingml/2006/main">
+              <a:graphicData uri="http://schemas.openxmlformats.org/drawingml/2006/picture">
+                <pic:pic xmlns:pic="http://schemas.openxmlformats.org/drawingml/2006/picture">
+                  <pic:nvPicPr>
+                    <pic:cNvPr id="1530314397" name=""/>
+                    <pic:cNvPicPr/>
+                  </pic:nvPicPr>
+                  <pic:blipFill>
+                    <a:blip r:embed="rId24"/>
+                    <a:stretch>
+                      <a:fillRect/>
+                    </a:stretch>
+                  </pic:blipFill>
+                  <pic:spPr>
+                    <a:xfrm>
+                      <a:off x="0" y="0"/>
+                      <a:ext cx="5943600" cy="3199130"/>
+                    </a:xfrm>
+                    <a:prstGeom prst="rect">
+                      <a:avLst/>
+                    </a:prstGeom>
+                  </pic:spPr>
+                </pic:pic>
+              </a:graphicData>
+            </a:graphic>
+          </wp:inline>
+        </w:drawing>
+      </w:r>
+      <w:r>
+        <w:drawing>
+          <wp:inline distT="0" distB="0" distL="0" distR="0" wp14:anchorId="31A06C93" wp14:editId="597518C8">
+            <wp:extent cx="5943600" cy="3211830"/>
+            <wp:effectExtent l="0" t="0" r="0" b="7620"/>
+            <wp:docPr id="612893624" name="Picture 1"/>
+            <wp:cNvGraphicFramePr>
+              <a:graphicFrameLocks xmlns:a="http://schemas.openxmlformats.org/drawingml/2006/main" noChangeAspect="1"/>
+            </wp:cNvGraphicFramePr>
+            <a:graphic xmlns:a="http://schemas.openxmlformats.org/drawingml/2006/main">
+              <a:graphicData uri="http://schemas.openxmlformats.org/drawingml/2006/picture">
+                <pic:pic xmlns:pic="http://schemas.openxmlformats.org/drawingml/2006/picture">
+                  <pic:nvPicPr>
+                    <pic:cNvPr id="612893624" name=""/>
+                    <pic:cNvPicPr/>
+                  </pic:nvPicPr>
+                  <pic:blipFill>
+                    <a:blip r:embed="rId25"/>
+                    <a:stretch>
+                      <a:fillRect/>
+                    </a:stretch>
+                  </pic:blipFill>
+                  <pic:spPr>
+                    <a:xfrm>
+                      <a:off x="0" y="0"/>
+                      <a:ext cx="5943600" cy="3211830"/>
+                    </a:xfrm>
+                    <a:prstGeom prst="rect">
+                      <a:avLst/>
+                    </a:prstGeom>
+                  </pic:spPr>
+                </pic:pic>
+              </a:graphicData>
+            </a:graphic>
+          </wp:inline>
+        </w:drawing>
+      </w:r>
+    </w:p>
+    <w:p>
+      <w:r>
+        <w:br w:type="page"/>
+      </w:r>
+    </w:p>
+    <w:p>
+      <w:pPr>
+        <w:jc w:val="center"/>
+        <w:rPr>
+          <w:b/>
+          <w:bCs/>
+          <w:sz w:val="32"/>
+          <w:szCs w:val="32"/>
+        </w:rPr>
+      </w:pPr>
+      <w:r>
+        <w:rPr>
+          <w:b/>
+          <w:bCs/>
+          <w:sz w:val="32"/>
+          <w:szCs w:val="32"/>
+        </w:rPr>
+        <w:lastRenderedPageBreak/>
+        <w:t xml:space="preserve">3.2 Password Hashing with </w:t>
+      </w:r>
+      <w:proofErr w:type="spellStart"/>
+      <w:r>
+        <w:rPr>
+          <w:b/>
+          <w:bCs/>
+          <w:sz w:val="32"/>
+          <w:szCs w:val="32"/>
+        </w:rPr>
+        <w:t>Bcrypt</w:t>
+      </w:r>
+      <w:proofErr w:type="spellEnd"/>
+      <w:r>
+        <w:rPr>
+          <w:b/>
+          <w:bCs/>
+          <w:sz w:val="32"/>
+          <w:szCs w:val="32"/>
+        </w:rPr>
+        <w:t xml:space="preserve"> (Fix for Weak Password Storage)</w:t>
+      </w:r>
+    </w:p>
+    <w:p/>
+    <w:p>
+      <w:r>
+        <w:t>Vulnerability Fixed: Weak/Plain Text Password Storage</w:t>
+      </w:r>
+    </w:p>
+    <w:p>
+      <w:r>
+        <w:t xml:space="preserve">Library Used: </w:t>
+      </w:r>
+      <w:proofErr w:type="spellStart"/>
+      <w:r>
+        <w:t>bcryptjs</w:t>
+      </w:r>
+      <w:proofErr w:type="spellEnd"/>
+    </w:p>
+    <w:p>
+      <w:r>
+        <w:t>File Created: middleware/passwordHashing.js</w:t>
+      </w:r>
+    </w:p>
+    <w:p/>
+    <w:p>
+      <w:r>
+        <w:t>Implementation:</w:t>
+      </w:r>
+    </w:p>
+    <w:p>
+      <w:r>
+        <w:t>- Salt rounds set to 12 (industry standard minimum is 10)</w:t>
+      </w:r>
+    </w:p>
+    <w:p>
+      <w:r>
+        <w:t>- Each password gets a unique random salt before hashing</w:t>
+      </w:r>
+    </w:p>
+    <w:p>
+      <w:r>
+        <w:t xml:space="preserve">- </w:t>
+      </w:r>
+      <w:proofErr w:type="spellStart"/>
+      <w:proofErr w:type="gramStart"/>
+      <w:r>
+        <w:t>bcrypt.compare</w:t>
+      </w:r>
+      <w:proofErr w:type="spellEnd"/>
+      <w:proofErr w:type="gramEnd"/>
+      <w:r>
+        <w:t>() used for verification — never decrypts, only compares hashes</w:t>
+      </w:r>
+    </w:p>
+    <w:p/>
+    <w:p>
+      <w:r>
+        <w:t>Before Fix: Passwords stored as MD5 hashes or plain text</w:t>
+      </w:r>
+      <w:r>
+        <w:t xml:space="preserve"> </w:t>
+      </w:r>
+      <w:r>
+        <w:t>crackable in seconds with rainbow tables</w:t>
+      </w:r>
+    </w:p>
+    <w:p>
+      <w:r>
+        <w:t xml:space="preserve">After Fix: </w:t>
+      </w:r>
+      <w:proofErr w:type="spellStart"/>
+      <w:r>
+        <w:t>bcrypt</w:t>
+      </w:r>
+      <w:proofErr w:type="spellEnd"/>
+      <w:r>
+        <w:t xml:space="preserve"> with salt rounds of 12 means each password </w:t>
+      </w:r>
+    </w:p>
+    <w:p>
+      <w:r>
+        <w:t>takes ~250ms to verify, making brute force attacks impractical</w:t>
+      </w:r>
+    </w:p>
+    <w:p>
+      <w:r>
+        <w:drawing>
+          <wp:inline distT="0" distB="0" distL="0" distR="0" wp14:anchorId="53F43764" wp14:editId="663BB24C">
+            <wp:extent cx="5943600" cy="1772920"/>
+            <wp:effectExtent l="0" t="0" r="0" b="0"/>
+            <wp:docPr id="765625084" name="Picture 1"/>
+            <wp:cNvGraphicFramePr>
+              <a:graphicFrameLocks xmlns:a="http://schemas.openxmlformats.org/drawingml/2006/main" noChangeAspect="1"/>
+            </wp:cNvGraphicFramePr>
+            <a:graphic xmlns:a="http://schemas.openxmlformats.org/drawingml/2006/main">
+              <a:graphicData uri="http://schemas.openxmlformats.org/drawingml/2006/picture">
+                <pic:pic xmlns:pic="http://schemas.openxmlformats.org/drawingml/2006/picture">
+                  <pic:nvPicPr>
+                    <pic:cNvPr id="765625084" name=""/>
+                    <pic:cNvPicPr/>
+                  </pic:nvPicPr>
+                  <pic:blipFill>
+                    <a:blip r:embed="rId26"/>
+                    <a:stretch>
+                      <a:fillRect/>
+                    </a:stretch>
+                  </pic:blipFill>
+                  <pic:spPr>
+                    <a:xfrm>
+                      <a:off x="0" y="0"/>
+                      <a:ext cx="5943600" cy="1772920"/>
+                    </a:xfrm>
+                    <a:prstGeom prst="rect">
+                      <a:avLst/>
+                    </a:prstGeom>
+                  </pic:spPr>
+                </pic:pic>
+              </a:graphicData>
+            </a:graphic>
+          </wp:inline>
+        </w:drawing>
+      </w:r>
+    </w:p>
+    <w:p>
+      <w:r>
+        <w:br w:type="page"/>
+      </w:r>
+    </w:p>
+    <w:p>
+      <w:pPr>
+        <w:jc w:val="center"/>
+        <w:rPr>
+          <w:b/>
+          <w:bCs/>
+          <w:sz w:val="32"/>
+          <w:szCs w:val="32"/>
+        </w:rPr>
+      </w:pPr>
+      <w:r>
+        <w:rPr>
+          <w:b/>
+          <w:bCs/>
+          <w:sz w:val="32"/>
+          <w:szCs w:val="32"/>
+        </w:rPr>
+        <w:lastRenderedPageBreak/>
+        <w:t>3.3 JWT Token-Based Authentication</w:t>
+      </w:r>
+    </w:p>
+    <w:p/>
+    <w:p>
+      <w:r>
+        <w:t>Vulnerability Fixed: Weak/Missing Authentication</w:t>
+      </w:r>
+    </w:p>
+    <w:p>
+      <w:r>
+        <w:t xml:space="preserve">Library Used: </w:t>
+      </w:r>
+      <w:proofErr w:type="spellStart"/>
+      <w:r>
+        <w:t>jsonwebtoken</w:t>
+      </w:r>
+      <w:proofErr w:type="spellEnd"/>
+    </w:p>
+    <w:p>
+      <w:r>
+        <w:t>File Created: middleware/jwtAuth.js</w:t>
+      </w:r>
+    </w:p>
+    <w:p/>
+    <w:p>
+      <w:r>
+        <w:t>Implementation:</w:t>
+      </w:r>
+    </w:p>
+    <w:p>
+      <w:r>
+        <w:t>- Tokens expire after 1 hour, limiting damage from stolen tokens</w:t>
+      </w:r>
+    </w:p>
+    <w:p>
+      <w:r>
+        <w:t>- HS256 algorithm used for signing</w:t>
+      </w:r>
+    </w:p>
+    <w:p>
+      <w:r>
+        <w:t>- Authorization header used (Bearer token pattern)</w:t>
+      </w:r>
+    </w:p>
+    <w:p>
+      <w:r>
+        <w:t>- Role-based access control included (user/admin)</w:t>
+      </w:r>
+    </w:p>
+    <w:p>
+      <w:r>
+        <w:t>- Secret key loaded from environment variable in production</w:t>
+      </w:r>
+    </w:p>
+    <w:p/>
+    <w:p>
+      <w:r>
+        <w:t xml:space="preserve">Before Fix: Session-based auth with no expiry, vulnerable to </w:t>
+      </w:r>
+    </w:p>
+    <w:p>
+      <w:r>
+        <w:t>session hijacking</w:t>
+      </w:r>
+    </w:p>
+    <w:p>
+      <w:r>
+        <w:t>After Fix: Stateless JWT with expiry and role checks on every</w:t>
+      </w:r>
+      <w:r>
+        <w:t xml:space="preserve"> </w:t>
+      </w:r>
+      <w:r>
+        <w:t>protected route</w:t>
+      </w:r>
+    </w:p>
+    <w:p>
+      <w:r>
+        <w:drawing>
+          <wp:inline distT="0" distB="0" distL="0" distR="0" wp14:anchorId="41A5E7C8" wp14:editId="4D79D9C1">
+            <wp:extent cx="5506278" cy="2835498"/>
+            <wp:effectExtent l="0" t="0" r="0" b="3175"/>
+            <wp:docPr id="1084190685" name="Picture 1"/>
+            <wp:cNvGraphicFramePr>
+              <a:graphicFrameLocks xmlns:a="http://schemas.openxmlformats.org/drawingml/2006/main" noChangeAspect="1"/>
+            </wp:cNvGraphicFramePr>
+            <a:graphic xmlns:a="http://schemas.openxmlformats.org/drawingml/2006/main">
+              <a:graphicData uri="http://schemas.openxmlformats.org/drawingml/2006/picture">
+                <pic:pic xmlns:pic="http://schemas.openxmlformats.org/drawingml/2006/picture">
+                  <pic:nvPicPr>
+                    <pic:cNvPr id="1084190685" name=""/>
+                    <pic:cNvPicPr/>
+                  </pic:nvPicPr>
+                  <pic:blipFill>
+                    <a:blip r:embed="rId27"/>
+                    <a:stretch>
+                      <a:fillRect/>
+                    </a:stretch>
+                  </pic:blipFill>
+                  <pic:spPr>
+                    <a:xfrm>
+                      <a:off x="0" y="0"/>
+                      <a:ext cx="5512234" cy="2838565"/>
+                    </a:xfrm>
+                    <a:prstGeom prst="rect">
+                      <a:avLst/>
+                    </a:prstGeom>
+                  </pic:spPr>
+                </pic:pic>
+              </a:graphicData>
+            </a:graphic>
+          </wp:inline>
+        </w:drawing>
+      </w:r>
+    </w:p>
+    <w:p>
+      <w:pPr>
+        <w:jc w:val="center"/>
+        <w:rPr>
+          <w:b/>
+          <w:bCs/>
+          <w:sz w:val="32"/>
+          <w:szCs w:val="32"/>
+        </w:rPr>
+      </w:pPr>
+      <w:r>
+        <w:rPr>
+          <w:b/>
+          <w:bCs/>
+          <w:sz w:val="32"/>
+          <w:szCs w:val="32"/>
+        </w:rPr>
+        <w:lastRenderedPageBreak/>
+        <w:t>3.4 HTTP Security Headers with Helmet.js</w:t>
+      </w:r>
+    </w:p>
+    <w:p/>
+    <w:p>
+      <w:r>
+        <w:t>Vulnerability Fixed: Missing Security Headers (found by ZAP scan)</w:t>
+      </w:r>
+    </w:p>
+    <w:p>
+      <w:r>
+        <w:t>Library Used: helmet.js</w:t>
+      </w:r>
+    </w:p>
+    <w:p>
+      <w:r>
+        <w:t>File Created: middleware/securityHeaders.js</w:t>
+      </w:r>
+    </w:p>
+    <w:p/>
+    <w:p>
+      <w:r>
+        <w:t>Headers Applied and Their Purpose:</w:t>
+      </w:r>
+    </w:p>
+    <w:p>
+      <w:r>
+        <w:t>- Content-Security-Policy: Prevents XSS by controlling which resources can load</w:t>
+      </w:r>
+    </w:p>
+    <w:p>
+      <w:r>
+        <w:t>- X-Frame-Options: Prevents clickjacking attacks</w:t>
+      </w:r>
+    </w:p>
+    <w:p>
+      <w:r>
+        <w:t>- X-Content-Type-Options: Prevents MIME type sniffing</w:t>
+      </w:r>
+    </w:p>
+    <w:p>
+      <w:r>
+        <w:t>- Strict-Transport-Security: Forces HTTPS connections</w:t>
+      </w:r>
+    </w:p>
+    <w:p>
+      <w:r>
+        <w:t>- X-XSS-Protection: Enables browser's built-in XSS filter</w:t>
+      </w:r>
+    </w:p>
+    <w:p>
+      <w:r>
+        <w:t>- Referrer-Policy: Controls referrer information leakage</w:t>
+      </w:r>
+    </w:p>
+    <w:p>
+      <w:r>
+        <w:t>Before Fix: No security headers — ZAP scan flagged multiple</w:t>
+      </w:r>
+      <w:r>
+        <w:t xml:space="preserve"> </w:t>
+      </w:r>
+      <w:r>
+        <w:t>missing header vulnerabilities</w:t>
+      </w:r>
+    </w:p>
+    <w:p>
+      <w:r>
+        <w:t>After Fix: All OWASP-recommended headers applied via Helmet.js</w:t>
+      </w:r>
+    </w:p>
+    <w:p>
+      <w:r>
+        <w:drawing>
+          <wp:inline distT="0" distB="0" distL="0" distR="0" wp14:anchorId="0596AAC6" wp14:editId="0F98A907">
+            <wp:extent cx="5943600" cy="3211830"/>
+            <wp:effectExtent l="0" t="0" r="0" b="7620"/>
+            <wp:docPr id="2041920672" name="Picture 1"/>
+            <wp:cNvGraphicFramePr>
+              <a:graphicFrameLocks xmlns:a="http://schemas.openxmlformats.org/drawingml/2006/main" noChangeAspect="1"/>
+            </wp:cNvGraphicFramePr>
+            <a:graphic xmlns:a="http://schemas.openxmlformats.org/drawingml/2006/main">
+              <a:graphicData uri="http://schemas.openxmlformats.org/drawingml/2006/picture">
+                <pic:pic xmlns:pic="http://schemas.openxmlformats.org/drawingml/2006/picture">
+                  <pic:nvPicPr>
+                    <pic:cNvPr id="2041920672" name=""/>
+                    <pic:cNvPicPr/>
+                  </pic:nvPicPr>
+                  <pic:blipFill>
+                    <a:blip r:embed="rId28"/>
+                    <a:stretch>
+                      <a:fillRect/>
+                    </a:stretch>
+                  </pic:blipFill>
+                  <pic:spPr>
+                    <a:xfrm>
+                      <a:off x="0" y="0"/>
+                      <a:ext cx="5943600" cy="3211830"/>
+                    </a:xfrm>
+                    <a:prstGeom prst="rect">
+                      <a:avLst/>
+                    </a:prstGeom>
+                  </pic:spPr>
+                </pic:pic>
+              </a:graphicData>
+            </a:graphic>
+          </wp:inline>
+        </w:drawing>
+      </w:r>
+    </w:p>
+    <w:p>
+      <w:pPr>
+        <w:jc w:val="center"/>
+        <w:rPr>
+          <w:b/>
+          <w:bCs/>
+          <w:sz w:val="32"/>
+          <w:szCs w:val="32"/>
+        </w:rPr>
+      </w:pPr>
+      <w:r>
+        <w:rPr>
+          <w:b/>
+          <w:bCs/>
+          <w:sz w:val="32"/>
+          <w:szCs w:val="32"/>
+        </w:rPr>
+        <w:lastRenderedPageBreak/>
+        <w:t>3.5 Security Logging with Winston</w:t>
+      </w:r>
+    </w:p>
+    <w:p/>
+    <w:p>
+      <w:r>
+        <w:t>Purpose: Detect and record security events for incident response</w:t>
+      </w:r>
+    </w:p>
+    <w:p>
+      <w:r>
+        <w:t xml:space="preserve">Library Used: </w:t>
+      </w:r>
+      <w:proofErr w:type="spellStart"/>
+      <w:r>
+        <w:t>winston</w:t>
+      </w:r>
+      <w:proofErr w:type="spellEnd"/>
+    </w:p>
+    <w:p>
+      <w:r>
+        <w:t>File Created: config/logger.js</w:t>
+      </w:r>
+    </w:p>
+    <w:p/>
+    <w:p>
+      <w:r>
+        <w:t>Logging Implementation:</w:t>
+      </w:r>
+    </w:p>
+    <w:p>
+      <w:r>
+        <w:t>- All logs saved to logs/security.log with timestamps</w:t>
+      </w:r>
+    </w:p>
+    <w:p>
+      <w:r>
+        <w:t>- Errors saved separately to logs/error.log</w:t>
+      </w:r>
+    </w:p>
+    <w:p>
+      <w:r>
+        <w:t>- Security-specific events tracked:</w:t>
+      </w:r>
+    </w:p>
+    <w:p>
+      <w:r>
+        <w:t xml:space="preserve">  * Login attempts (success and failure) with IP addresses</w:t>
+      </w:r>
+    </w:p>
+    <w:p>
+      <w:r>
+        <w:t xml:space="preserve">  * XSS injection attempts — blocked and logged</w:t>
+      </w:r>
+    </w:p>
+    <w:p>
+      <w:r>
+        <w:t xml:space="preserve">  * SQL injection attempts — blocked and logged</w:t>
+      </w:r>
+    </w:p>
+    <w:p>
+      <w:r>
+        <w:t xml:space="preserve">  * Suspicious input detected in any field</w:t>
+      </w:r>
+    </w:p>
+    <w:p/>
+    <w:p>
+      <w:r>
+        <w:t xml:space="preserve">Importance: Without logging, attacks happen silently. These logs </w:t>
+      </w:r>
+    </w:p>
+    <w:p>
+      <w:r>
+        <w:t>allow security teams to detect patterns, identify attackers by IP,</w:t>
+      </w:r>
+    </w:p>
+    <w:p>
+      <w:r>
+        <w:t>and respond to incidents.</w:t>
+      </w:r>
+    </w:p>
+    <w:p/>
+    <w:p>
+      <w:r>
+        <w:drawing>
+          <wp:inline distT="0" distB="0" distL="0" distR="0" wp14:anchorId="0F173EEF" wp14:editId="3113C786">
+            <wp:extent cx="5943600" cy="1539240"/>
+            <wp:effectExtent l="0" t="0" r="0" b="3810"/>
+            <wp:docPr id="627353741" name="Picture 1"/>
+            <wp:cNvGraphicFramePr>
+              <a:graphicFrameLocks xmlns:a="http://schemas.openxmlformats.org/drawingml/2006/main" noChangeAspect="1"/>
+            </wp:cNvGraphicFramePr>
+            <a:graphic xmlns:a="http://schemas.openxmlformats.org/drawingml/2006/main">
+              <a:graphicData uri="http://schemas.openxmlformats.org/drawingml/2006/picture">
+                <pic:pic xmlns:pic="http://schemas.openxmlformats.org/drawingml/2006/picture">
+                  <pic:nvPicPr>
+                    <pic:cNvPr id="627353741" name=""/>
+                    <pic:cNvPicPr/>
+                  </pic:nvPicPr>
+                  <pic:blipFill>
+                    <a:blip r:embed="rId29"/>
+                    <a:stretch>
+                      <a:fillRect/>
+                    </a:stretch>
+                  </pic:blipFill>
+                  <pic:spPr>
+                    <a:xfrm>
+                      <a:off x="0" y="0"/>
+                      <a:ext cx="5943600" cy="1539240"/>
+                    </a:xfrm>
+                    <a:prstGeom prst="rect">
+                      <a:avLst/>
+                    </a:prstGeom>
+                  </pic:spPr>
+                </pic:pic>
+              </a:graphicData>
+            </a:graphic>
+          </wp:inline>
+        </w:drawing>
+      </w:r>
+    </w:p>
+    <w:p>
+      <w:r>
+        <w:br w:type="page"/>
+      </w:r>
+    </w:p>
     <w:p/>
     <w:sectPr>
       <w:pgSz w:w="12240" w:h="15840"/>
@@ -3365,6 +4201,7 @@
   <w:style w:type="character" w:default="1" w:styleId="DefaultParagraphFont">
     <w:name w:val="Default Paragraph Font"/>
     <w:uiPriority w:val="1"/>
+    <w:semiHidden/>
     <w:unhideWhenUsed/>
   </w:style>
   <w:style w:type="table" w:default="1" w:styleId="TableNormal">

</xml_diff>